<commit_message>
docs(rag): section 8 ultra-detaillee (deux bases, embeddings, cosinus, exemple chiffre, semantique)
Co-authored-by: lyesatb <lyesatb@users.noreply.github.com>
</commit_message>
<xml_diff>
--- a/docs/Documentation_RAG_Smart_Planning_JCDecaux.docx
+++ b/docs/Documentation_RAG_Smart_Planning_JCDecaux.docx
@@ -1883,6 +1883,1081 @@
         <w:t>Augmenter k (ex. 3 → 4) pour donner plus de contexte à l'IA au prix de quelques tokens.</w:t>
       </w:r>
     </w:p>
+    <w:p>
+      <w:r>
+        <w:br w:type="page"/>
+      </w:r>
+    </w:p>
+    <w:p>
+      <w:pPr>
+        <w:pStyle w:val="Heading1"/>
+      </w:pPr>
+      <w:r>
+        <w:t>8. Zoom ultra-détaillé : où sont cherchés les mots, et comment</w:t>
+      </w:r>
+    </w:p>
+    <w:p>
+      <w:r>
+        <w:rPr>
+          <w:b w:val="0"/>
+          <w:i w:val="0"/>
+        </w:rPr>
+        <w:t>Cette section répond précisément à la question : « où trouve-t-il les mots ? Est-ce dans notre base, alors que ce sont NOS mots qu'on cherche ? ». On descend au niveau le plus fin, étape par étape, avec un exemple chiffré.</w:t>
+      </w:r>
+    </w:p>
+    <w:p>
+      <w:pPr>
+        <w:pStyle w:val="Heading2"/>
+      </w:pPr>
+      <w:r>
+        <w:t>8.1  Rappel fondamental : il existe DEUX bases distinctes</w:t>
+      </w:r>
+    </w:p>
+    <w:p>
+      <w:r>
+        <w:rPr>
+          <w:b w:val="0"/>
+          <w:i w:val="0"/>
+        </w:rPr>
+        <w:t>Le mot « base » désigne deux choses totalement séparées dans l'application. Les confondre est la source n°1 d'incompréhension.</w:t>
+      </w:r>
+    </w:p>
+    <w:tbl>
+      <w:tblPr>
+        <w:tblStyle w:val="LightGrid-Accent1"/>
+        <w:tblW w:type="auto" w:w="0"/>
+        <w:jc w:val="center"/>
+        <w:tblLook w:firstColumn="1" w:firstRow="1" w:lastColumn="0" w:lastRow="0" w:noHBand="0" w:noVBand="1" w:val="04A0"/>
+      </w:tblPr>
+      <w:tblGrid>
+        <w:gridCol w:w="2880"/>
+        <w:gridCol w:w="2880"/>
+        <w:gridCol w:w="2880"/>
+      </w:tblGrid>
+      <w:tr>
+        <w:tc>
+          <w:tcPr>
+            <w:tcW w:type="dxa" w:w="1584"/>
+            <w:shd w:val="clear" w:fill="265AA0"/>
+          </w:tcPr>
+          <w:p>
+            <w:r/>
+            <w:r>
+              <w:rPr>
+                <w:b/>
+                <w:color w:val="FFFFFF"/>
+                <w:sz w:val="20"/>
+              </w:rPr>
+            </w:r>
+          </w:p>
+        </w:tc>
+        <w:tc>
+          <w:tcPr>
+            <w:tcW w:type="dxa" w:w="3888"/>
+            <w:shd w:val="clear" w:fill="265AA0"/>
+          </w:tcPr>
+          <w:p>
+            <w:r/>
+            <w:r>
+              <w:rPr>
+                <w:b/>
+                <w:color w:val="FFFFFF"/>
+                <w:sz w:val="20"/>
+              </w:rPr>
+              <w:t>Base des PANNEAUX</w:t>
+            </w:r>
+          </w:p>
+        </w:tc>
+        <w:tc>
+          <w:tcPr>
+            <w:tcW w:type="dxa" w:w="3888"/>
+            <w:shd w:val="clear" w:fill="265AA0"/>
+          </w:tcPr>
+          <w:p>
+            <w:r/>
+            <w:r>
+              <w:rPr>
+                <w:b/>
+                <w:color w:val="FFFFFF"/>
+                <w:sz w:val="20"/>
+              </w:rPr>
+              <w:t>Base du RAG (vectorielle)</w:t>
+            </w:r>
+          </w:p>
+        </w:tc>
+      </w:tr>
+      <w:tr>
+        <w:tc>
+          <w:tcPr>
+            <w:tcW w:type="dxa" w:w="1584"/>
+          </w:tcPr>
+          <w:p>
+            <w:r/>
+            <w:r>
+              <w:rPr>
+                <w:sz w:val="19"/>
+              </w:rPr>
+              <w:t>Contenu</w:t>
+            </w:r>
+          </w:p>
+        </w:tc>
+        <w:tc>
+          <w:tcPr>
+            <w:tcW w:type="dxa" w:w="3888"/>
+          </w:tcPr>
+          <w:p>
+            <w:r/>
+            <w:r>
+              <w:rPr>
+                <w:sz w:val="19"/>
+              </w:rPr>
+              <w:t>10 000 panneaux + magasins (panels.csv, stores.csv)</w:t>
+            </w:r>
+          </w:p>
+        </w:tc>
+        <w:tc>
+          <w:tcPr>
+            <w:tcW w:type="dxa" w:w="3888"/>
+          </w:tcPr>
+          <w:p>
+            <w:r/>
+            <w:r>
+              <w:rPr>
+                <w:sz w:val="19"/>
+              </w:rPr>
+              <w:t>Uniquement les 5 documents de règles (rag_docs/*.md)</w:t>
+            </w:r>
+          </w:p>
+        </w:tc>
+      </w:tr>
+      <w:tr>
+        <w:tc>
+          <w:tcPr>
+            <w:tcW w:type="dxa" w:w="1584"/>
+          </w:tcPr>
+          <w:p>
+            <w:r/>
+            <w:r>
+              <w:rPr>
+                <w:sz w:val="19"/>
+              </w:rPr>
+              <w:t>Qui l'utilise</w:t>
+            </w:r>
+          </w:p>
+        </w:tc>
+        <w:tc>
+          <w:tcPr>
+            <w:tcW w:type="dxa" w:w="3888"/>
+          </w:tcPr>
+          <w:p>
+            <w:r/>
+            <w:r>
+              <w:rPr>
+                <w:sz w:val="19"/>
+              </w:rPr>
+              <w:t>Le moteur de calcul (scoring, distances, budget)</w:t>
+            </w:r>
+          </w:p>
+        </w:tc>
+        <w:tc>
+          <w:tcPr>
+            <w:tcW w:type="dxa" w:w="3888"/>
+          </w:tcPr>
+          <w:p>
+            <w:r/>
+            <w:r>
+              <w:rPr>
+                <w:sz w:val="19"/>
+              </w:rPr>
+              <w:t>Le RAG (rédaction des textes)</w:t>
+            </w:r>
+          </w:p>
+        </w:tc>
+      </w:tr>
+      <w:tr>
+        <w:tc>
+          <w:tcPr>
+            <w:tcW w:type="dxa" w:w="1584"/>
+          </w:tcPr>
+          <w:p>
+            <w:r/>
+            <w:r>
+              <w:rPr>
+                <w:sz w:val="19"/>
+              </w:rPr>
+              <w:t>Format</w:t>
+            </w:r>
+          </w:p>
+        </w:tc>
+        <w:tc>
+          <w:tcPr>
+            <w:tcW w:type="dxa" w:w="3888"/>
+          </w:tcPr>
+          <w:p>
+            <w:r/>
+            <w:r>
+              <w:rPr>
+                <w:sz w:val="19"/>
+              </w:rPr>
+              <w:t>Tableaux de chiffres (CSV)</w:t>
+            </w:r>
+          </w:p>
+        </w:tc>
+        <w:tc>
+          <w:tcPr>
+            <w:tcW w:type="dxa" w:w="3888"/>
+          </w:tcPr>
+          <w:p>
+            <w:r/>
+            <w:r>
+              <w:rPr>
+                <w:sz w:val="19"/>
+              </w:rPr>
+              <w:t>Vecteurs de sens (ChromaDB)</w:t>
+            </w:r>
+          </w:p>
+        </w:tc>
+      </w:tr>
+      <w:tr>
+        <w:tc>
+          <w:tcPr>
+            <w:tcW w:type="dxa" w:w="1584"/>
+          </w:tcPr>
+          <w:p>
+            <w:r/>
+            <w:r>
+              <w:rPr>
+                <w:sz w:val="19"/>
+              </w:rPr>
+              <w:t>Rôle</w:t>
+            </w:r>
+          </w:p>
+        </w:tc>
+        <w:tc>
+          <w:tcPr>
+            <w:tcW w:type="dxa" w:w="3888"/>
+          </w:tcPr>
+          <w:p>
+            <w:r/>
+            <w:r>
+              <w:rPr>
+                <w:sz w:val="19"/>
+              </w:rPr>
+              <w:t>PRODUIT les chiffres du plan</w:t>
+            </w:r>
+          </w:p>
+        </w:tc>
+        <w:tc>
+          <w:tcPr>
+            <w:tcW w:type="dxa" w:w="3888"/>
+          </w:tcPr>
+          <w:p>
+            <w:r/>
+            <w:r>
+              <w:rPr>
+                <w:sz w:val="19"/>
+              </w:rPr>
+              <w:t>GUIDE la formulation des justifications</w:t>
+            </w:r>
+          </w:p>
+        </w:tc>
+      </w:tr>
+    </w:tbl>
+    <w:p>
+      <w:pPr>
+        <w:spacing w:after="80"/>
+      </w:pPr>
+    </w:p>
+    <w:p>
+      <w:pPr>
+        <w:spacing w:before="80" w:after="160"/>
+        <w:ind w:left="120"/>
+        <w:shd w:val="clear" w:color="auto" w:fill="EAF1FB"/>
+        <w:pBdr>
+          <w:top w:val="single" w:sz="6" w:space="6" w:color="C9D6E8"/>
+          <w:left w:val="single" w:sz="6" w:space="6" w:color="C9D6E8"/>
+          <w:bottom w:val="single" w:sz="6" w:space="6" w:color="C9D6E8"/>
+          <w:right w:val="single" w:sz="6" w:space="6" w:color="C9D6E8"/>
+        </w:pBdr>
+      </w:pPr>
+      <w:r>
+        <w:rPr>
+          <w:b/>
+          <w:color w:val="1A3F73"/>
+          <w:sz w:val="21"/>
+        </w:rPr>
+        <w:t>Le RAG ne regarde JAMAIS la base des panneaux. Et le moteur de calcul ne regarde JAMAIS la base du RAG. Ce sont deux mondes séparés.</w:t>
+      </w:r>
+    </w:p>
+    <w:p>
+      <w:pPr>
+        <w:pStyle w:val="Heading2"/>
+      </w:pPr>
+      <w:r>
+        <w:t>8.2  Qui vient d'où : les mots de la question vs la base fouillée</w:t>
+      </w:r>
+    </w:p>
+    <w:p>
+      <w:r>
+        <w:rPr>
+          <w:b w:val="0"/>
+          <w:i w:val="0"/>
+        </w:rPr>
+        <w:t>Il faut bien séparer « ce qu'on cherche » (les mots) et « où on cherche » (la base). Voici l'origine exacte de chaque élément :</w:t>
+      </w:r>
+    </w:p>
+    <w:tbl>
+      <w:tblPr>
+        <w:tblStyle w:val="LightGrid-Accent1"/>
+        <w:tblW w:type="auto" w:w="0"/>
+        <w:jc w:val="center"/>
+        <w:tblLook w:firstColumn="1" w:firstRow="1" w:lastColumn="0" w:lastRow="0" w:noHBand="0" w:noVBand="1" w:val="04A0"/>
+      </w:tblPr>
+      <w:tblGrid>
+        <w:gridCol w:w="4320"/>
+        <w:gridCol w:w="4320"/>
+      </w:tblGrid>
+      <w:tr>
+        <w:tc>
+          <w:tcPr>
+            <w:tcW w:type="dxa" w:w="4896"/>
+            <w:shd w:val="clear" w:fill="265AA0"/>
+          </w:tcPr>
+          <w:p>
+            <w:r/>
+            <w:r>
+              <w:rPr>
+                <w:b/>
+                <w:color w:val="FFFFFF"/>
+                <w:sz w:val="20"/>
+              </w:rPr>
+              <w:t>Élément</w:t>
+            </w:r>
+          </w:p>
+        </w:tc>
+        <w:tc>
+          <w:tcPr>
+            <w:tcW w:type="dxa" w:w="4464"/>
+            <w:shd w:val="clear" w:fill="265AA0"/>
+          </w:tcPr>
+          <w:p>
+            <w:r/>
+            <w:r>
+              <w:rPr>
+                <w:b/>
+                <w:color w:val="FFFFFF"/>
+                <w:sz w:val="20"/>
+              </w:rPr>
+              <w:t>Provient de…</w:t>
+            </w:r>
+          </w:p>
+        </w:tc>
+      </w:tr>
+      <w:tr>
+        <w:tc>
+          <w:tcPr>
+            <w:tcW w:type="dxa" w:w="4896"/>
+          </w:tcPr>
+          <w:p>
+            <w:r/>
+            <w:r>
+              <w:rPr>
+                <w:sz w:val="19"/>
+              </w:rPr>
+              <w:t>Les mots de la requête (premium, CSP+, gare…)</w:t>
+            </w:r>
+          </w:p>
+        </w:tc>
+        <w:tc>
+          <w:tcPr>
+            <w:tcW w:type="dxa" w:w="4464"/>
+          </w:tcPr>
+          <w:p>
+            <w:r/>
+            <w:r>
+              <w:rPr>
+                <w:sz w:val="19"/>
+              </w:rPr>
+              <w:t>La demande du CLIENT (son brief extrait)</w:t>
+            </w:r>
+          </w:p>
+        </w:tc>
+      </w:tr>
+      <w:tr>
+        <w:tc>
+          <w:tcPr>
+            <w:tcW w:type="dxa" w:w="4896"/>
+          </w:tcPr>
+          <w:p>
+            <w:r/>
+            <w:r>
+              <w:rPr>
+                <w:sz w:val="19"/>
+              </w:rPr>
+              <w:t>Les documents fouillés</w:t>
+            </w:r>
+          </w:p>
+        </w:tc>
+        <w:tc>
+          <w:tcPr>
+            <w:tcW w:type="dxa" w:w="4464"/>
+          </w:tcPr>
+          <w:p>
+            <w:r/>
+            <w:r>
+              <w:rPr>
+                <w:sz w:val="19"/>
+              </w:rPr>
+              <w:t>UNIQUEMENT nos 5 fichiers rag_docs/*.md</w:t>
+            </w:r>
+          </w:p>
+        </w:tc>
+      </w:tr>
+      <w:tr>
+        <w:tc>
+          <w:tcPr>
+            <w:tcW w:type="dxa" w:w="4896"/>
+          </w:tcPr>
+          <w:p>
+            <w:r/>
+            <w:r>
+              <w:rPr>
+                <w:sz w:val="19"/>
+              </w:rPr>
+              <w:t>Le passage retrouvé (le résultat)</w:t>
+            </w:r>
+          </w:p>
+        </w:tc>
+        <w:tc>
+          <w:tcPr>
+            <w:tcW w:type="dxa" w:w="4464"/>
+          </w:tcPr>
+          <w:p>
+            <w:r/>
+            <w:r>
+              <w:rPr>
+                <w:sz w:val="19"/>
+              </w:rPr>
+              <w:t>Un extrait de NOS documents (jamais d'ailleurs)</w:t>
+            </w:r>
+          </w:p>
+        </w:tc>
+      </w:tr>
+      <w:tr>
+        <w:tc>
+          <w:tcPr>
+            <w:tcW w:type="dxa" w:w="4896"/>
+          </w:tcPr>
+          <w:p>
+            <w:r/>
+            <w:r>
+              <w:rPr>
+                <w:sz w:val="19"/>
+              </w:rPr>
+              <w:t>Les panneaux, magasins, distances</w:t>
+            </w:r>
+          </w:p>
+        </w:tc>
+        <w:tc>
+          <w:tcPr>
+            <w:tcW w:type="dxa" w:w="4464"/>
+          </w:tcPr>
+          <w:p>
+            <w:r/>
+            <w:r>
+              <w:rPr>
+                <w:sz w:val="19"/>
+              </w:rPr>
+              <w:t>PAS dans le RAG — moteur de calcul séparé</w:t>
+            </w:r>
+          </w:p>
+        </w:tc>
+      </w:tr>
+    </w:tbl>
+    <w:p>
+      <w:pPr>
+        <w:spacing w:after="80"/>
+      </w:pPr>
+    </w:p>
+    <w:p>
+      <w:pPr>
+        <w:spacing w:before="80" w:after="160"/>
+        <w:ind w:left="120"/>
+        <w:shd w:val="clear" w:color="auto" w:fill="F2F4F8"/>
+        <w:pBdr>
+          <w:top w:val="single" w:sz="6" w:space="6" w:color="D8DEE8"/>
+          <w:left w:val="single" w:sz="6" w:space="6" w:color="D8DEE8"/>
+          <w:bottom w:val="single" w:sz="6" w:space="6" w:color="D8DEE8"/>
+          <w:right w:val="single" w:sz="6" w:space="6" w:color="D8DEE8"/>
+        </w:pBdr>
+      </w:pPr>
+      <w:r>
+        <w:rPr>
+          <w:rFonts w:ascii="Consolas" w:hAnsi="Consolas" w:cs="Consolas"/>
+          <w:color w:val="1B222E"/>
+          <w:sz w:val="18"/>
+        </w:rPr>
+        <w:t xml:space="preserve">  MOTS DE LA QUESTION                LA BASE FOUILLÉE</w:t>
+        <w:br/>
+        <w:t xml:space="preserve">  (viennent du client)               (= NOS 5 règles, rien d'autre)</w:t>
+        <w:br/>
+        <w:t xml:space="preserve">  ───────────────────                ─────────────────────────────</w:t>
+        <w:br/>
+        <w:t xml:space="preserve">  'premium, CSP+, gare, Paris'  →→→  premium_campaigns.md   ✔ (le plus proche)</w:t>
+        <w:br/>
+        <w:t xml:space="preserve">                                     regles_metier.md       ✔</w:t>
+        <w:br/>
+        <w:t xml:space="preserve">                                     planning_rules.md      ✔</w:t>
+        <w:br/>
+        <w:t xml:space="preserve">                                     formats_dooh.md</w:t>
+        <w:br/>
+        <w:t xml:space="preserve">                                     glossary.md</w:t>
+      </w:r>
+    </w:p>
+    <w:p>
+      <w:r>
+        <w:rPr>
+          <w:b w:val="0"/>
+          <w:i w:val="0"/>
+        </w:rPr>
+        <w:t>Donc oui : on prend les mots du CLIENT, et on va chercher, DANS NOTRE base de règles, le document dont le SENS est le plus proche. Le résultat est toujours un morceau de nos propres documents.</w:t>
+      </w:r>
+    </w:p>
+    <w:p>
+      <w:pPr>
+        <w:pStyle w:val="Heading2"/>
+      </w:pPr>
+      <w:r>
+        <w:t>8.3  Qu'est-ce qu'un « embedding », exactement ?</w:t>
+      </w:r>
+    </w:p>
+    <w:p>
+      <w:r>
+        <w:rPr>
+          <w:b w:val="0"/>
+          <w:i w:val="0"/>
+        </w:rPr>
+        <w:t>Un embedding est la traduction d'un texte en une liste de nombres — un « vecteur » — qui représente son SENS. C'est le modèle d'embedding (ici FastEmbed / bge-small) qui fait cette traduction.</w:t>
+      </w:r>
+    </w:p>
+    <w:p>
+      <w:pPr>
+        <w:pStyle w:val="ListBullet"/>
+      </w:pPr>
+      <w:r>
+        <w:t>Chaque texte devient un vecteur de 384 nombres (384 « dimensions ») avec le modèle par défaut.</w:t>
+      </w:r>
+    </w:p>
+    <w:p>
+      <w:pPr>
+        <w:pStyle w:val="ListBullet"/>
+      </w:pPr>
+      <w:r>
+        <w:t>Chaque dimension est une sorte de « coordonnée de sens » apprise par le modèle (transport, luxe, alimentaire, lieu, etc. — de façon abstraite, pas nommée).</w:t>
+      </w:r>
+    </w:p>
+    <w:p>
+      <w:pPr>
+        <w:pStyle w:val="ListBullet"/>
+      </w:pPr>
+      <w:r>
+        <w:t>Deux textes de sens PROCHE donnent deux vecteurs PROCHES (qui pointent dans la même direction).</w:t>
+      </w:r>
+    </w:p>
+    <w:p>
+      <w:r>
+        <w:rPr>
+          <w:b w:val="0"/>
+          <w:i w:val="0"/>
+        </w:rPr>
+        <w:t>Exemple simplifié à 3 dimensions imaginaires [transport, premium, alimentaire] (la réalité en a 384, apprises automatiquement) :</w:t>
+      </w:r>
+    </w:p>
+    <w:p>
+      <w:pPr>
+        <w:spacing w:before="80" w:after="160"/>
+        <w:ind w:left="120"/>
+        <w:shd w:val="clear" w:color="auto" w:fill="F2F4F8"/>
+        <w:pBdr>
+          <w:top w:val="single" w:sz="6" w:space="6" w:color="D8DEE8"/>
+          <w:left w:val="single" w:sz="6" w:space="6" w:color="D8DEE8"/>
+          <w:bottom w:val="single" w:sz="6" w:space="6" w:color="D8DEE8"/>
+          <w:right w:val="single" w:sz="6" w:space="6" w:color="D8DEE8"/>
+        </w:pBdr>
+      </w:pPr>
+      <w:r>
+        <w:rPr>
+          <w:rFonts w:ascii="Consolas" w:hAnsi="Consolas" w:cs="Consolas"/>
+          <w:color w:val="1B222E"/>
+          <w:sz w:val="18"/>
+        </w:rPr>
+        <w:t>texte                          → vecteur [transport, premium, alimentaire]</w:t>
+        <w:br/>
+        <w:t>'gares premium CSP+'  (requête) →  [ 0.8 ,  0.6 ,  0.1 ]</w:t>
+        <w:br/>
+        <w:t>premium_campaigns.md            →  [ 0.7 ,  0.7 ,  0.0 ]</w:t>
+        <w:br/>
+        <w:t>formats_dooh.md                 →  [ 0.5 ,  0.4 ,  0.1 ]</w:t>
+        <w:br/>
+        <w:t>(doc imaginaire alimentaire)    →  [ 0.1 ,  0.1 ,  0.9 ]</w:t>
+      </w:r>
+    </w:p>
+    <w:p>
+      <w:r>
+        <w:rPr>
+          <w:b w:val="0"/>
+          <w:i w:val="0"/>
+        </w:rPr>
+        <w:t>Important : ces vecteurs sont pré-calculés et STOCKÉS dans ChromaDB au moment de l'indexation. La question, elle, est vectorisée à la volée à chaque appel.</w:t>
+      </w:r>
+    </w:p>
+    <w:p>
+      <w:pPr>
+        <w:pStyle w:val="Heading2"/>
+      </w:pPr>
+      <w:r>
+        <w:t>8.4  Comment on mesure la « proximité » : la similarité cosinus</w:t>
+      </w:r>
+    </w:p>
+    <w:p>
+      <w:r>
+        <w:rPr>
+          <w:b w:val="0"/>
+          <w:i w:val="0"/>
+        </w:rPr>
+        <w:t>Pour savoir quel document ressemble le plus à la question, on compare la DIRECTION des vecteurs (pas leur longueur). La mesure standard est la similarité cosinus : c'est le cosinus de l'angle entre les deux vecteurs.</w:t>
+      </w:r>
+    </w:p>
+    <w:p>
+      <w:pPr>
+        <w:pStyle w:val="ListBullet"/>
+      </w:pPr>
+      <w:r>
+        <w:t>Deux vecteurs qui pointent dans la même direction → cosinus proche de 1 (très similaire).</w:t>
+      </w:r>
+    </w:p>
+    <w:p>
+      <w:pPr>
+        <w:pStyle w:val="ListBullet"/>
+      </w:pPr>
+      <w:r>
+        <w:t>Deux vecteurs perpendiculaires (sans rapport) → cosinus proche de 0.</w:t>
+      </w:r>
+    </w:p>
+    <w:p>
+      <w:pPr>
+        <w:spacing w:before="80" w:after="160"/>
+        <w:ind w:left="120"/>
+        <w:shd w:val="clear" w:color="auto" w:fill="F2F4F8"/>
+        <w:pBdr>
+          <w:top w:val="single" w:sz="6" w:space="6" w:color="D8DEE8"/>
+          <w:left w:val="single" w:sz="6" w:space="6" w:color="D8DEE8"/>
+          <w:bottom w:val="single" w:sz="6" w:space="6" w:color="D8DEE8"/>
+          <w:right w:val="single" w:sz="6" w:space="6" w:color="D8DEE8"/>
+        </w:pBdr>
+      </w:pPr>
+      <w:r>
+        <w:rPr>
+          <w:rFonts w:ascii="Consolas" w:hAnsi="Consolas" w:cs="Consolas"/>
+          <w:color w:val="1B222E"/>
+          <w:sz w:val="18"/>
+        </w:rPr>
+        <w:t xml:space="preserve">                A · B</w:t>
+        <w:br/>
+        <w:t>cos(A, B) = ─────────────</w:t>
+        <w:br/>
+        <w:t xml:space="preserve">             ‖A‖ × ‖B‖</w:t>
+        <w:br/>
+        <w:br/>
+        <w:t>A · B  (produit scalaire) = a1·b1 + a2·b2 + a3·b3 + ...</w:t>
+        <w:br/>
+        <w:t>‖A‖    (longueur)         = racine( a1² + a2² + a3² + ... )</w:t>
+      </w:r>
+    </w:p>
+    <w:p>
+      <w:pPr>
+        <w:pStyle w:val="Heading2"/>
+      </w:pPr>
+      <w:r>
+        <w:t>8.5  Micro-exemple chiffré (calcul à la main)</w:t>
+      </w:r>
+    </w:p>
+    <w:p>
+      <w:r>
+        <w:rPr>
+          <w:b w:val="0"/>
+          <w:i w:val="0"/>
+        </w:rPr>
+        <w:t>Reprenons la requête q = [0.8, 0.6, 0.1] et comparons-la à deux documents.</w:t>
+      </w:r>
+    </w:p>
+    <w:p>
+      <w:r>
+        <w:rPr>
+          <w:b/>
+          <w:i w:val="0"/>
+        </w:rPr>
+        <w:t>Document 1 — premium_campaigns.md, d1 = [0.7, 0.7, 0.0] :</w:t>
+      </w:r>
+    </w:p>
+    <w:p>
+      <w:pPr>
+        <w:spacing w:before="80" w:after="160"/>
+        <w:ind w:left="120"/>
+        <w:shd w:val="clear" w:color="auto" w:fill="F2F4F8"/>
+        <w:pBdr>
+          <w:top w:val="single" w:sz="6" w:space="6" w:color="D8DEE8"/>
+          <w:left w:val="single" w:sz="6" w:space="6" w:color="D8DEE8"/>
+          <w:bottom w:val="single" w:sz="6" w:space="6" w:color="D8DEE8"/>
+          <w:right w:val="single" w:sz="6" w:space="6" w:color="D8DEE8"/>
+        </w:pBdr>
+      </w:pPr>
+      <w:r>
+        <w:rPr>
+          <w:rFonts w:ascii="Consolas" w:hAnsi="Consolas" w:cs="Consolas"/>
+          <w:color w:val="1B222E"/>
+          <w:sz w:val="18"/>
+        </w:rPr>
+        <w:t>q · d1 = 0.8×0.7 + 0.6×0.7 + 0.1×0.0 = 0.56 + 0.42 + 0 = 0.98</w:t>
+        <w:br/>
+        <w:t>‖q‖   = racine(0.64 + 0.36 + 0.01) = racine(1.01) ≈ 1.005</w:t>
+        <w:br/>
+        <w:t>‖d1‖  = racine(0.49 + 0.49 + 0.00) = racine(0.98) ≈ 0.990</w:t>
+        <w:br/>
+        <w:t>cos(q, d1) = 0.98 / (1.005 × 0.990) ≈ 0.985     → TRÈS proche</w:t>
+      </w:r>
+    </w:p>
+    <w:p>
+      <w:r>
+        <w:rPr>
+          <w:b/>
+          <w:i w:val="0"/>
+        </w:rPr>
+        <w:t>Document 3 — doc alimentaire imaginaire, d3 = [0.1, 0.1, 0.9] :</w:t>
+      </w:r>
+    </w:p>
+    <w:p>
+      <w:pPr>
+        <w:spacing w:before="80" w:after="160"/>
+        <w:ind w:left="120"/>
+        <w:shd w:val="clear" w:color="auto" w:fill="F2F4F8"/>
+        <w:pBdr>
+          <w:top w:val="single" w:sz="6" w:space="6" w:color="D8DEE8"/>
+          <w:left w:val="single" w:sz="6" w:space="6" w:color="D8DEE8"/>
+          <w:bottom w:val="single" w:sz="6" w:space="6" w:color="D8DEE8"/>
+          <w:right w:val="single" w:sz="6" w:space="6" w:color="D8DEE8"/>
+        </w:pBdr>
+      </w:pPr>
+      <w:r>
+        <w:rPr>
+          <w:rFonts w:ascii="Consolas" w:hAnsi="Consolas" w:cs="Consolas"/>
+          <w:color w:val="1B222E"/>
+          <w:sz w:val="18"/>
+        </w:rPr>
+        <w:t>q · d3 = 0.8×0.1 + 0.6×0.1 + 0.1×0.9 = 0.08 + 0.06 + 0.09 = 0.23</w:t>
+        <w:br/>
+        <w:t>‖d3‖  = racine(0.01 + 0.01 + 0.81) = racine(0.83) ≈ 0.911</w:t>
+        <w:br/>
+        <w:t>cos(q, d3) = 0.23 / (1.005 × 0.911) ≈ 0.251     → éloigné</w:t>
+      </w:r>
+    </w:p>
+    <w:p>
+      <w:r>
+        <w:rPr>
+          <w:b w:val="0"/>
+          <w:i w:val="0"/>
+        </w:rPr>
+        <w:t>Résultat : 0.985 pour le document premium contre 0.251 pour le document alimentaire. Le RAG classe donc premium_campaigns.md en tête et écarte l'alimentaire. C'est exactement ce que fait similarity_search, mais sur 384 dimensions et sur les 5 documents à la fois.</w:t>
+      </w:r>
+    </w:p>
+    <w:p>
+      <w:pPr>
+        <w:pStyle w:val="Heading2"/>
+      </w:pPr>
+      <w:r>
+        <w:t>8.6  Pourquoi « gare » retrouve un texte qui dit « pôle de transport »</w:t>
+      </w:r>
+    </w:p>
+    <w:p>
+      <w:r>
+        <w:rPr>
+          <w:b w:val="0"/>
+          <w:i w:val="0"/>
+        </w:rPr>
+        <w:t>C'est LE point clé, et ce qui différencie le RAG d'un simple « Ctrl+F ».</w:t>
+      </w:r>
+    </w:p>
+    <w:p>
+      <w:pPr>
+        <w:pStyle w:val="ListBullet"/>
+      </w:pPr>
+      <w:r>
+        <w:rPr>
+          <w:b/>
+        </w:rPr>
+        <w:t xml:space="preserve">Recherche par mot-clé : </w:t>
+      </w:r>
+      <w:r>
+        <w:t>Un Ctrl+F cherche le mot EXACT : « gare » ne trouverait rien dans un texte qui dit seulement « pôle de transport ».</w:t>
+      </w:r>
+    </w:p>
+    <w:p>
+      <w:pPr>
+        <w:pStyle w:val="ListBullet"/>
+      </w:pPr>
+      <w:r>
+        <w:rPr>
+          <w:b/>
+        </w:rPr>
+        <w:t xml:space="preserve">Recherche par le sens (RAG) : </w:t>
+      </w:r>
+      <w:r>
+        <w:t>le modèle d'embedding a appris que « gare » et « pôle de transport » apparaissent dans des contextes similaires → il leur donne des vecteurs proches. Le document remonte MÊME SANS le mot exact.</w:t>
+      </w:r>
+    </w:p>
+    <w:p>
+      <w:r>
+        <w:rPr>
+          <w:b w:val="0"/>
+          <w:i w:val="0"/>
+        </w:rPr>
+        <w:t>Autrement dit, on ne cherche pas « le mot » dans la base : on cherche « le sens » de la demande, et on récupère le document dont le sens est le plus proche. C'est pour cela qu'on parle de recherche sémantique.</w:t>
+      </w:r>
+    </w:p>
+    <w:p>
+      <w:pPr>
+        <w:pStyle w:val="Heading2"/>
+      </w:pPr>
+      <w:r>
+        <w:t>8.7  Le déroulé exact, ligne de code par ligne de code</w:t>
+      </w:r>
+    </w:p>
+    <w:p>
+      <w:pPr>
+        <w:pStyle w:val="ListNumber"/>
+      </w:pPr>
+      <w:r>
+        <w:rPr>
+          <w:b/>
+        </w:rPr>
+        <w:t xml:space="preserve">Construction de la requête : </w:t>
+      </w:r>
+      <w:r>
+        <w:t>le brief du client fournit les mots (premium, CSP+, gare, Paris) ; l'agent en fait une phrase de requête.</w:t>
+      </w:r>
+    </w:p>
+    <w:p>
+      <w:pPr>
+        <w:pStyle w:val="ListNumber"/>
+      </w:pPr>
+      <w:r>
+        <w:rPr>
+          <w:b/>
+        </w:rPr>
+        <w:t xml:space="preserve">Vectorisation : </w:t>
+      </w:r>
+      <w:r>
+        <w:t>similarity_search transforme cette phrase en vecteur (384 nombres) via le modèle d'embedding.</w:t>
+      </w:r>
+    </w:p>
+    <w:p>
+      <w:pPr>
+        <w:pStyle w:val="ListNumber"/>
+      </w:pPr>
+      <w:r>
+        <w:rPr>
+          <w:b/>
+        </w:rPr>
+        <w:t xml:space="preserve">Comparaison : </w:t>
+      </w:r>
+      <w:r>
+        <w:t>elle calcule la similarité cosinus entre ce vecteur et le vecteur pré-stocké de CHACUN des 5 documents.</w:t>
+      </w:r>
+    </w:p>
+    <w:p>
+      <w:pPr>
+        <w:pStyle w:val="ListNumber"/>
+      </w:pPr>
+      <w:r>
+        <w:rPr>
+          <w:b/>
+        </w:rPr>
+        <w:t xml:space="preserve">Classement : </w:t>
+      </w:r>
+      <w:r>
+        <w:t>elle trie les 5 documents par score décroissant et garde les k premiers (k=3 dans le pipeline).</w:t>
+      </w:r>
+    </w:p>
+    <w:p>
+      <w:pPr>
+        <w:pStyle w:val="ListNumber"/>
+      </w:pPr>
+      <w:r>
+        <w:rPr>
+          <w:b/>
+        </w:rPr>
+        <w:t xml:space="preserve">Restitution : </w:t>
+      </w:r>
+      <w:r>
+        <w:t>elle retourne le contenu + la source (nom de fichier) de ces k documents.</w:t>
+      </w:r>
+    </w:p>
+    <w:p>
+      <w:pPr>
+        <w:spacing w:before="80" w:after="160"/>
+        <w:ind w:left="120"/>
+        <w:shd w:val="clear" w:color="auto" w:fill="F2F4F8"/>
+        <w:pBdr>
+          <w:top w:val="single" w:sz="6" w:space="6" w:color="D8DEE8"/>
+          <w:left w:val="single" w:sz="6" w:space="6" w:color="D8DEE8"/>
+          <w:bottom w:val="single" w:sz="6" w:space="6" w:color="D8DEE8"/>
+          <w:right w:val="single" w:sz="6" w:space="6" w:color="D8DEE8"/>
+        </w:pBdr>
+      </w:pPr>
+      <w:r>
+        <w:rPr>
+          <w:rFonts w:ascii="Consolas" w:hAnsi="Consolas" w:cs="Consolas"/>
+          <w:color w:val="1B222E"/>
+          <w:sz w:val="18"/>
+        </w:rPr>
+        <w:t>results = vs.similarity_search(query, k=3)</w:t>
+        <w:br/>
+        <w:t>#   1. embed(query)            → vecteur de la question</w:t>
+        <w:br/>
+        <w:t>#   2. pour chaque doc stocké : cos(vecteur_question, vecteur_doc)</w:t>
+        <w:br/>
+        <w:t>#   3. trie par cos décroissant</w:t>
+        <w:br/>
+        <w:t>#   4. garde les 3 meilleurs</w:t>
+        <w:br/>
+        <w:t>matches = [{'content': r.page_content, 'source': r.metadata['source']}</w:t>
+        <w:br/>
+        <w:t xml:space="preserve">           for r in results]</w:t>
+      </w:r>
+    </w:p>
+    <w:p>
+      <w:pPr>
+        <w:pStyle w:val="Heading2"/>
+      </w:pPr>
+      <w:r>
+        <w:t>8.8  Détail : 1 fichier = 1 vecteur (pas de découpage)</w:t>
+      </w:r>
+    </w:p>
+    <w:p>
+      <w:r>
+        <w:rPr>
+          <w:b w:val="0"/>
+          <w:i w:val="0"/>
+        </w:rPr>
+        <w:t>Dans notre configuration, chaque document .md est indexé en entier (pas de découpage en paragraphes). Conséquence :</w:t>
+      </w:r>
+    </w:p>
+    <w:p>
+      <w:pPr>
+        <w:pStyle w:val="ListBullet"/>
+      </w:pPr>
+      <w:r>
+        <w:t>le vecteur d'un document représente le sens GLOBAL de tout le fichier ;</w:t>
+      </w:r>
+    </w:p>
+    <w:p>
+      <w:pPr>
+        <w:pStyle w:val="ListBullet"/>
+      </w:pPr>
+      <w:r>
+        <w:t>comme nos documents sont courts et thématiques (un fichier = un sujet), c'est parfaitement adapté et la pertinence reste bonne ;</w:t>
+      </w:r>
+    </w:p>
+    <w:p>
+      <w:pPr>
+        <w:pStyle w:val="ListBullet"/>
+      </w:pPr>
+      <w:r>
+        <w:t>si un jour un document devient long et couvre plusieurs sujets, il faudrait le découper en morceaux (chunking) pour garder une recherche fine.</w:t>
+      </w:r>
+    </w:p>
+    <w:p>
+      <w:pPr>
+        <w:pStyle w:val="Heading2"/>
+      </w:pPr>
+      <w:r>
+        <w:t>8.9  Limites et bonnes pratiques (transparence)</w:t>
+      </w:r>
+    </w:p>
+    <w:p>
+      <w:pPr>
+        <w:spacing w:before="80" w:after="160"/>
+        <w:ind w:left="120"/>
+        <w:shd w:val="clear" w:color="auto" w:fill="FFF6E6"/>
+        <w:pBdr>
+          <w:top w:val="single" w:sz="6" w:space="6" w:color="C9D6E8"/>
+          <w:left w:val="single" w:sz="6" w:space="6" w:color="C9D6E8"/>
+          <w:bottom w:val="single" w:sz="6" w:space="6" w:color="C9D6E8"/>
+          <w:right w:val="single" w:sz="6" w:space="6" w:color="C9D6E8"/>
+        </w:pBdr>
+      </w:pPr>
+      <w:r>
+        <w:rPr>
+          <w:b/>
+          <w:color w:val="1A3F73"/>
+          <w:sz w:val="21"/>
+        </w:rPr>
+        <w:t>Le modèle d'embedding par défaut (bge-small-en) est optimisé pour l'ANGLAIS, alors que nos documents sont en français. Ça marche, mais un modèle multilingue améliorerait la finesse de la recherche. Changement simple : la variable FASTEMBED_MODEL.</w:t>
+      </w:r>
+    </w:p>
+    <w:p>
+      <w:pPr>
+        <w:pStyle w:val="ListBullet"/>
+      </w:pPr>
+      <w:r>
+        <w:t>La qualité dépend de la qualité des documents : mieux ils sont écrits, mieux le RAG guide.</w:t>
+      </w:r>
+    </w:p>
+    <w:p>
+      <w:pPr>
+        <w:pStyle w:val="ListBullet"/>
+      </w:pPr>
+      <w:r>
+        <w:t>k=3 est un compromis (assez de contexte sans surcharger le prompt). On peut l'ajuster.</w:t>
+      </w:r>
+    </w:p>
+    <w:p>
+      <w:pPr>
+        <w:pStyle w:val="ListBullet"/>
+      </w:pPr>
+      <w:r>
+        <w:t>Le RAG ne remplace pas la validation humaine, qui reste obligatoire (règle métier).</w:t>
+      </w:r>
+    </w:p>
+    <w:p>
+      <w:pPr>
+        <w:pStyle w:val="Heading2"/>
+      </w:pPr>
+      <w:r>
+        <w:t>8.10  En résumé (la réponse directe à la question)</w:t>
+      </w:r>
+    </w:p>
+    <w:p>
+      <w:pPr>
+        <w:spacing w:before="80" w:after="160"/>
+        <w:ind w:left="120"/>
+        <w:shd w:val="clear" w:color="auto" w:fill="FDEDED"/>
+        <w:pBdr>
+          <w:top w:val="single" w:sz="6" w:space="6" w:color="C9D6E8"/>
+          <w:left w:val="single" w:sz="6" w:space="6" w:color="C9D6E8"/>
+          <w:bottom w:val="single" w:sz="6" w:space="6" w:color="C9D6E8"/>
+          <w:right w:val="single" w:sz="6" w:space="6" w:color="C9D6E8"/>
+        </w:pBdr>
+      </w:pPr>
+      <w:r>
+        <w:rPr>
+          <w:b/>
+          <w:color w:val="B02A2A"/>
+          <w:sz w:val="21"/>
+        </w:rPr>
+        <w:t>On ne cherche pas « nos mots » dans une base extérieure. On prend les mots de la DEMANDE du client, on les traduit en sens (vecteur), et on les compare — par le SENS — au sens de NOS 5 documents de règles. Le résultat est toujours un extrait de nos propres documents. Les panneaux et les chiffres ne sont jamais impliqués dans cette recherche.</w:t>
+      </w:r>
+    </w:p>
     <w:sectPr>
       <w:pgSz w:w="12240" w:h="15840"/>
       <w:pgMar w:top="1440" w:right="1800" w:bottom="1440" w:left="1800" w:header="720" w:footer="720" w:gutter="0"/>

</xml_diff>